<commit_message>
Update GET Player Profile Header .docx
</commit_message>
<xml_diff>
--- a/docs/GET Player Profile Header .docx
+++ b/docs/GET Player Profile Header .docx
@@ -143,6 +143,27 @@
       <w:proofErr w:type="spellEnd"/>
       <w:r>
         <w:t>": 15</w:t>
+      </w:r>
+      <w:r>
+        <w:t>,</w:t>
+      </w:r>
+    </w:p>
+    <w:p>
+      <w:r>
+        <w:t xml:space="preserve">        "</w:t>
+      </w:r>
+      <w:proofErr w:type="spellStart"/>
+      <w:proofErr w:type="gramStart"/>
+      <w:r>
+        <w:t>max</w:t>
+      </w:r>
+      <w:proofErr w:type="gramEnd"/>
+      <w:r>
+        <w:t>_level_exp</w:t>
+      </w:r>
+      <w:proofErr w:type="spellEnd"/>
+      <w:r>
+        <w:t>": 4421</w:t>
       </w:r>
     </w:p>
     <w:p>
@@ -768,6 +789,7 @@
   <w:style w:type="character" w:default="1" w:styleId="DefaultParagraphFont">
     <w:name w:val="Default Paragraph Font"/>
     <w:uiPriority w:val="1"/>
+    <w:semiHidden/>
     <w:unhideWhenUsed/>
   </w:style>
   <w:style w:type="table" w:default="1" w:styleId="TableNormal">

</xml_diff>